<commit_message>
Đồng bộ hai website theo app bản 375 (thêm Học tập và làm theo Bác — QĐ 2995, Tuần 9–10)
Co-Authored-By: Claude Opus 5.5 <noreply@anthropic.com>
</commit_message>
<xml_diff>
--- a/assets/docs/lop1/Dao duc - Lop 1.docx
+++ b/assets/docs/lop1/Dao duc - Lop 1.docx
@@ -566,7 +566,7 @@
                 <w:i w:val="0"/>
                 <w:sz w:val="20"/>
               </w:rPr>
-              <w:t>CĐ 1: Tự chăm sóc</w:t>
+              <w:t>Chủ đề 1: Tự chăm sóc bản thân</w:t>
             </w:r>
           </w:p>
         </w:tc>
@@ -696,7 +696,7 @@
                 <w:i w:val="0"/>
                 <w:sz w:val="20"/>
               </w:rPr>
-              <w:t>CĐ 1: Tự chăm sóc</w:t>
+              <w:t>Chủ đề 1: Tự chăm sóc bản thân</w:t>
             </w:r>
           </w:p>
         </w:tc>
@@ -826,7 +826,7 @@
                 <w:i w:val="0"/>
                 <w:sz w:val="20"/>
               </w:rPr>
-              <w:t>CĐ 1: Tự chăm sóc</w:t>
+              <w:t>Chủ đề 1: Tự chăm sóc bản thân</w:t>
             </w:r>
           </w:p>
         </w:tc>
@@ -943,7 +943,7 @@
                 <w:i w:val="0"/>
                 <w:sz w:val="20"/>
               </w:rPr>
-              <w:t>CĐ 1: Tự chăm sóc</w:t>
+              <w:t>Chủ đề 1: Tự chăm sóc bản thân</w:t>
             </w:r>
           </w:p>
         </w:tc>
@@ -1073,7 +1073,7 @@
                 <w:i w:val="0"/>
                 <w:sz w:val="20"/>
               </w:rPr>
-              <w:t>CĐ 2: Yêu thương</w:t>
+              <w:t>Chủ đề 2: Yêu thương gia đình</w:t>
             </w:r>
           </w:p>
         </w:tc>
@@ -1203,7 +1203,7 @@
                 <w:i w:val="0"/>
                 <w:sz w:val="20"/>
               </w:rPr>
-              <w:t>CĐ 2: Yêu thương</w:t>
+              <w:t>Chủ đề 2: Yêu thương gia đình</w:t>
             </w:r>
           </w:p>
         </w:tc>

</xml_diff>